<commit_message>
Update CV: second year, schools and talks, current teaching
- Second-year PhD and thesis title; CDT name fixed; MInf styling;
  settled status.
- New Schools, Talks and Events section (climbing hackathon, IEEE RAS
  summer school, IPAB talk, ROMANDIC winter school).
- Research experience newest first; planner entry runs to present with a
  results bullet; drone project (Sep. 2025 - Jan. 2026) cut to one line;
  stale submission lines and repeated supervisor removed.
- Teaching: ARO Fall 2025 & Fall 2026 first, SDP Spring 2026, sentence
  case; Functional Programming TA (2022) removed.
- Awards before Skills, one line each; skills refreshed (GCS, IRIS,
  MuJoCo, constrained sampling) without filler.
- Consistent Dr./Prof., en dashes and abbreviated months.
- Layout: 10.5 pt body at 1.1 line spacing, left-aligned, plain dates,
  bold event names, smaller bullet indent. Two pages.

Co-Authored-By: Claude Opus 5.5 <noreply@anthropic.com>
</commit_message>
<xml_diff>
--- a/files/JULIA LOPEZ GOMEZ_CV.docx
+++ b/files/JULIA LOPEZ GOMEZ_CV.docx
@@ -33,28 +33,7 @@
           <w:i/>
           <w:iCs/>
         </w:rPr>
-        <w:t>Edinburgh, UK (</w:t>
-      </w:r>
-      <w:r>
-        <w:rPr>
-          <w:i/>
-          <w:iCs/>
-        </w:rPr>
-        <w:t>pre-settlement</w:t>
-      </w:r>
-      <w:r>
-        <w:rPr>
-          <w:i/>
-          <w:iCs/>
-        </w:rPr>
-        <w:t xml:space="preserve"> </w:t>
-      </w:r>
-      <w:r>
-        <w:rPr>
-          <w:i/>
-          <w:iCs/>
-        </w:rPr>
-        <w:t xml:space="preserve">status) | Mobile: 07857 973 108 | Email address: </w:t>
+        <w:t xml:space="preserve">Edinburgh, UK (settled status) | Mobile: 07857 973 108 | Email address: </w:t>
       </w:r>
       <w:hyperlink r:id="rId6" w:history="1">
         <w:r>
@@ -120,67 +99,7 @@
         <w:jc w:val="left"/>
       </w:pPr>
       <w:r>
-        <w:t xml:space="preserve">First year PhD student in Robotics, part of the </w:t>
-      </w:r>
-      <w:r>
-        <w:t xml:space="preserve">UKRI AI Centre </w:t>
-      </w:r>
-      <w:r>
-        <w:t>for</w:t>
-      </w:r>
-      <w:r>
-        <w:t xml:space="preserve"> Doctoral Training </w:t>
-      </w:r>
-      <w:r>
-        <w:t>in</w:t>
-      </w:r>
-      <w:r>
-        <w:t xml:space="preserve"> Dependable and Deployable Artificial Intelligence Robotics</w:t>
-      </w:r>
-      <w:r>
-        <w:t xml:space="preserve"> (CDT-D2AIR), f</w:t>
-      </w:r>
-      <w:r>
-        <w:t xml:space="preserve">ocusing on </w:t>
-      </w:r>
-      <w:r>
-        <w:t>Motion and Manipulation Planning</w:t>
-      </w:r>
-      <w:r>
-        <w:t xml:space="preserve">, </w:t>
-      </w:r>
-      <w:r>
-        <w:t>Control, Trajectory Optimisation, and Reinforcement Learning.</w:t>
-      </w:r>
-      <w:r>
-        <w:t xml:space="preserve"> </w:t>
-      </w:r>
-      <w:r>
-        <w:t>Supervised by Dr Steve Tonneau, and currently a member of the MARBLE Group (</w:t>
-      </w:r>
-      <w:r>
-        <w:t>Multi-Agent, Reinforcement, Behavio</w:t>
-      </w:r>
-      <w:r>
-        <w:t>u</w:t>
-      </w:r>
-      <w:r>
-        <w:t>r and L</w:t>
-      </w:r>
-      <w:r>
-        <w:t>e</w:t>
-      </w:r>
-      <w:r>
-        <w:t>arning</w:t>
-      </w:r>
-      <w:r>
-        <w:t xml:space="preserve">) </w:t>
-      </w:r>
-      <w:r>
-        <w:t>under</w:t>
-      </w:r>
-      <w:r>
-        <w:t xml:space="preserve"> Prof. David Abel.</w:t>
+        <w:t xml:space="preserve">Second-year PhD student in Robotics and AI, part of the UKRI AI Centre for Doctoral Training in Dependable and Deployable Artificial Intelligence for Robotics (CDT-D2AIR), working on representations of reachable behaviour for long-horizon motion and manipulation planning. Supervised by Dr. Steve Tonneau, and currently a member of the MARBLE Group (Multi-Agent, Reinforcement, Behaviour and Learning) under Prof. David Abel.</w:t>
       </w:r>
     </w:p>
     <w:p>
@@ -211,38 +130,11 @@
         <w:rPr>
           <w:rStyle w:val="Ttulo3Car"/>
         </w:rPr>
-        <w:t>The University of Edinburgh</w:t>
-      </w:r>
-      <w:r>
-        <w:rPr>
-          <w:rStyle w:val="Ttulo3Car"/>
-        </w:rPr>
-        <w:t xml:space="preserve"> and </w:t>
-      </w:r>
-      <w:r>
-        <w:rPr>
-          <w:rStyle w:val="Ttulo3Car"/>
-        </w:rPr>
-        <w:t>Heriot-Watt University</w:t>
-      </w:r>
-      <w:r>
-        <w:rPr>
-          <w:rStyle w:val="Ttulo3Car"/>
-        </w:rPr>
-        <w:t>, UK</w:t>
+        <w:t xml:space="preserve">The University of Edinburgh and Heriot-Watt University, UK</w:t>
       </w:r>
       <w:r>
         <w:tab/>
-        <w:t>202</w:t>
-      </w:r>
-      <w:r>
-        <w:t>5</w:t>
-      </w:r>
-      <w:r>
-        <w:t xml:space="preserve"> – 202</w:t>
-      </w:r>
-      <w:r>
-        <w:t>9</w:t>
+        <w:t xml:space="preserve">2025 – 2029</w:t>
       </w:r>
     </w:p>
     <w:p>
@@ -275,39 +167,7 @@
         <w:rPr>
           <w:lang w:val="en-US" w:eastAsia="es-ES_tradnl"/>
         </w:rPr>
-        <w:t>Keywords</w:t>
-      </w:r>
-      <w:r>
-        <w:rPr>
-          <w:lang w:val="en-US" w:eastAsia="es-ES_tradnl"/>
-        </w:rPr>
-        <w:t xml:space="preserve">: Motion and Manipulation Planning, Safe Trajectory </w:t>
-      </w:r>
-      <w:proofErr w:type="spellStart"/>
-      <w:r>
-        <w:rPr>
-          <w:lang w:val="en-US" w:eastAsia="es-ES_tradnl"/>
-        </w:rPr>
-        <w:t>Optimisation</w:t>
-      </w:r>
-      <w:proofErr w:type="spellEnd"/>
-      <w:r>
-        <w:rPr>
-          <w:lang w:val="en-US" w:eastAsia="es-ES_tradnl"/>
-        </w:rPr>
-        <w:t>, Learned Skill Representation, Reinforcement Learning</w:t>
-      </w:r>
-      <w:r>
-        <w:rPr>
-          <w:lang w:val="en-US" w:eastAsia="es-ES_tradnl"/>
-        </w:rPr>
-        <w:t>, Control</w:t>
-      </w:r>
-      <w:r>
-        <w:rPr>
-          <w:lang w:val="en-US" w:eastAsia="es-ES_tradnl"/>
-        </w:rPr>
-        <w:t>.</w:t>
+        <w:t xml:space="preserve">Thesis: Representations of Reachable Behaviour for Planning in Long-Horizon Robotics Tasks.</w:t>
       </w:r>
     </w:p>
     <w:p>
@@ -326,19 +186,7 @@
         <w:rPr>
           <w:lang w:val="en-US" w:eastAsia="es-ES_tradnl"/>
         </w:rPr>
-        <w:t xml:space="preserve">Supervision: </w:t>
-      </w:r>
-      <w:r>
-        <w:rPr>
-          <w:lang w:val="en-US" w:eastAsia="es-ES_tradnl"/>
-        </w:rPr>
-        <w:t>D</w:t>
-      </w:r>
-      <w:r>
-        <w:rPr>
-          <w:lang w:val="en-US" w:eastAsia="es-ES_tradnl"/>
-        </w:rPr>
-        <w:t>r. Steve Tonneau.</w:t>
+        <w:t xml:space="preserve">Supervision: Dr. Steve Tonneau.</w:t>
       </w:r>
     </w:p>
     <w:p>
@@ -385,17 +233,16 @@
           <w:b/>
           <w:bCs/>
         </w:rPr>
-        <w:t>MINF Informatics (1st Class)</w:t>
+        <w:t>MInf Informatics, First-Class Honours</w:t>
       </w:r>
     </w:p>
     <w:p>
       <w:pPr>
         <w:pStyle w:val="Prrafodelista"/>
         <w:numPr>
-          <w:ilvl w:val="3"/>
+          <w:ilvl w:val="0"/>
           <w:numId w:val="31"/>
         </w:numPr>
-        <w:ind w:left="709"/>
         <w:rPr>
           <w:lang w:val="en-US" w:eastAsia="es-ES_tradnl"/>
         </w:rPr>
@@ -404,31 +251,16 @@
         <w:rPr>
           <w:lang w:val="en-US" w:eastAsia="es-ES_tradnl"/>
         </w:rPr>
-        <w:t xml:space="preserve">Integrated Bachelor’s + </w:t>
-      </w:r>
-      <w:proofErr w:type="gramStart"/>
-      <w:r>
-        <w:rPr>
-          <w:lang w:val="en-US" w:eastAsia="es-ES_tradnl"/>
-        </w:rPr>
-        <w:t>Master’s in Informatics</w:t>
-      </w:r>
-      <w:proofErr w:type="gramEnd"/>
-      <w:r>
-        <w:rPr>
-          <w:lang w:val="en-US" w:eastAsia="es-ES_tradnl"/>
-        </w:rPr>
-        <w:t>.</w:t>
+        <w:t xml:space="preserve">Integrated Bachelor’s + Master’s in Informatics.</w:t>
       </w:r>
     </w:p>
     <w:p>
       <w:pPr>
         <w:pStyle w:val="Prrafodelista"/>
         <w:numPr>
-          <w:ilvl w:val="3"/>
+          <w:ilvl w:val="0"/>
           <w:numId w:val="31"/>
         </w:numPr>
-        <w:ind w:left="709"/>
         <w:rPr>
           <w:rStyle w:val="Ttulo3Car"/>
           <w:i w:val="0"/>
@@ -476,25 +308,122 @@
         <w:rPr>
           <w:rStyle w:val="Ttulo3Car"/>
         </w:rPr>
+        <w:t>The University of Edinburgh, UK</w:t>
+      </w:r>
+      <w:r>
+        <w:tab/>
+        <w:t>2023 – Present</w:t>
+      </w:r>
+    </w:p>
+    <w:p>
+      <w:pPr>
+        <w:pStyle w:val="Ttulo2"/>
+        <w:tabs>
+          <w:tab w:val="right" w:pos="9923"/>
+        </w:tabs>
+        <w:jc w:val="left"/>
+        <w:rPr>
+          <w:b w:val="0"/>
+          <w:bCs w:val="0"/>
+          <w:i/>
+          <w:iCs/>
+          <w:lang w:val="en-US" w:eastAsia="es-ES_tradnl"/>
+        </w:rPr>
+      </w:pPr>
+      <w:r>
+        <w:rPr>
+          <w:lang w:val="en-US" w:eastAsia="es-ES_tradnl"/>
+        </w:rPr>
+        <w:t>Optimisation-Based Manipulation Planning in Convex Decompositions of C-free</w:t>
+      </w:r>
+    </w:p>
+    <w:p>
+      <w:pPr>
+        <w:pStyle w:val="Prrafodelista"/>
+        <w:numPr>
+          <w:ilvl w:val="0"/>
+          <w:numId w:val="18"/>
+        </w:numPr>
+        <w:jc w:val="left"/>
+        <w:rPr>
+          <w:lang w:val="en-US" w:eastAsia="es-ES_tradnl"/>
+        </w:rPr>
+      </w:pPr>
+      <w:r>
+        <w:rPr>
+          <w:lang w:val="en-US" w:eastAsia="es-ES_tradnl"/>
+        </w:rPr>
+        <w:t xml:space="preserve">MInf thesis, continued in my PhD: a convex-optimisation manipulation planner, now on a Franka arm.</w:t>
+      </w:r>
+    </w:p>
+    <w:p>
+      <w:pPr>
+        <w:pStyle w:val="Prrafodelista"/>
+        <w:numPr>
+          <w:ilvl w:val="0"/>
+          <w:numId w:val="18"/>
+        </w:numPr>
+        <w:jc w:val="left"/>
+        <w:rPr>
+          <w:lang w:val="en-US" w:eastAsia="es-ES_tradnl"/>
+        </w:rPr>
+      </w:pPr>
+      <w:r>
+        <w:rPr>
+          <w:lang w:val="en-US" w:eastAsia="es-ES_tradnl"/>
+        </w:rPr>
+        <w:t xml:space="preserve">Finds minimum-regrasp plans via MIQP and Graphs of Convex Sets, tested on bottle-cap opening.</w:t>
+      </w:r>
+    </w:p>
+    <w:p>
+      <w:pPr>
+        <w:pStyle w:val="Prrafodelista"/>
+        <w:numPr>
+          <w:ilvl w:val="0"/>
+          <w:numId w:val="18"/>
+        </w:numPr>
+        <w:jc w:val="left"/>
+        <w:rPr>
+          <w:lang w:val="en-US" w:eastAsia="es-ES_tradnl"/>
+        </w:rPr>
+      </w:pPr>
+      <w:r>
+        <w:rPr>
+          <w:lang w:val="en-US" w:eastAsia="es-ES_tradnl"/>
+        </w:rPr>
+        <w:t xml:space="preserve">Implemented in Drake; applied robot kinematics, algebraic rotations and trajectory optimisation.</w:t>
+      </w:r>
+    </w:p>
+    <w:p>
+      <w:pPr>
+        <w:pStyle w:val="Prrafodelista"/>
+        <w:jc w:val="left"/>
+        <w:rPr>
+          <w:lang w:val="en-US" w:eastAsia="es-ES_tradnl"/>
+        </w:rPr>
+      </w:pPr>
+    </w:p>
+    <w:p>
+      <w:pPr>
+        <w:tabs>
+          <w:tab w:val="right" w:pos="9923"/>
+        </w:tabs>
+        <w:jc w:val="left"/>
+        <w:rPr>
+          <w:rStyle w:val="Ttulo3Car"/>
+          <w:i w:val="0"/>
+          <w:iCs w:val="0"/>
+        </w:rPr>
+      </w:pPr>
+      <w:r>
+        <w:rPr>
+          <w:rStyle w:val="Ttulo3Car"/>
+        </w:rPr>
         <w:t>Heriot-Watt University, UK</w:t>
       </w:r>
       <w:r>
-        <w:rPr>
-          <w:rStyle w:val="Ttulo3Car"/>
-        </w:rPr>
         <w:tab/>
-      </w:r>
-      <w:r>
-        <w:rPr>
-          <w:rStyle w:val="Ttulo3Car"/>
-        </w:rPr>
-        <w:t xml:space="preserve">Sep. </w:t>
-      </w:r>
-      <w:r>
-        <w:rPr>
-          <w:rStyle w:val="Ttulo3Car"/>
-        </w:rPr>
-        <w:t>2025 - Present</w:t>
+        <w:t xml:space="preserve">Sep. 2025 – Jan. 2026</w:t>
       </w:r>
     </w:p>
     <w:p>
@@ -515,27 +444,7 @@
           <w:i w:val="0"/>
           <w:iCs w:val="0"/>
         </w:rPr>
-        <w:t xml:space="preserve">Safety Evaluation of </w:t>
-      </w:r>
-      <w:r>
-        <w:rPr>
-          <w:rStyle w:val="Ttulo3Car"/>
-          <w:b/>
-          <w:bCs/>
-          <w:i w:val="0"/>
-          <w:iCs w:val="0"/>
-        </w:rPr>
-        <w:t>NN</w:t>
-      </w:r>
-      <w:r>
-        <w:rPr>
-          <w:rStyle w:val="Ttulo3Car"/>
-          <w:b/>
-          <w:bCs/>
-          <w:i w:val="0"/>
-          <w:iCs w:val="0"/>
-        </w:rPr>
-        <w:t xml:space="preserve"> Control for Drone Delivery Systems</w:t>
+        <w:t xml:space="preserve">Safety Evaluation of NN Control for Drone Delivery Systems</w:t>
       </w:r>
       <w:r>
         <w:rPr>
@@ -567,31 +476,76 @@
           <w:i w:val="0"/>
           <w:iCs w:val="0"/>
         </w:rPr>
-        <w:t>Investigated</w:t>
-      </w:r>
-      <w:r>
+        <w:t xml:space="preserve">Team project: robust training and formal verification (Vehicle + Marabou) of NN drone controllers.</w:t>
+      </w:r>
+    </w:p>
+    <w:p>
+      <w:pPr>
+        <w:tabs>
+          <w:tab w:val="right" w:pos="9923"/>
+        </w:tabs>
+        <w:jc w:val="left"/>
+        <w:rPr>
+          <w:rStyle w:val="Ttulo3Car"/>
+          <w:b/>
+          <w:bCs/>
+          <w:i w:val="0"/>
+          <w:iCs w:val="0"/>
+        </w:rPr>
+      </w:pPr>
+    </w:p>
+    <w:p>
+      <w:pPr>
+        <w:tabs>
+          <w:tab w:val="right" w:pos="9923"/>
+        </w:tabs>
+        <w:jc w:val="left"/>
         <w:rPr>
           <w:rStyle w:val="Ttulo3Car"/>
           <w:i w:val="0"/>
           <w:iCs w:val="0"/>
         </w:rPr>
-        <w:t xml:space="preserve"> robustness and formal safety evaluation of neural network controllers for quadrotor drone delivery with </w:t>
-      </w:r>
+      </w:pPr>
       <w:r>
         <w:rPr>
           <w:rStyle w:val="Ttulo3Car"/>
+        </w:rPr>
+        <w:t xml:space="preserve">LAAS-CNRS and New York University (NYU), Remote</w:t>
+      </w:r>
+      <w:r>
+        <w:tab/>
+        <w:t xml:space="preserve">Apr. – May 2025</w:t>
+      </w:r>
+    </w:p>
+    <w:p>
+      <w:pPr>
+        <w:tabs>
+          <w:tab w:val="right" w:pos="9923"/>
+        </w:tabs>
+        <w:jc w:val="left"/>
+        <w:rPr>
+          <w:rStyle w:val="Ttulo3Car"/>
+          <w:b/>
+          <w:bCs/>
           <w:i w:val="0"/>
           <w:iCs w:val="0"/>
         </w:rPr>
-        <w:t xml:space="preserve">a </w:t>
-      </w:r>
+      </w:pPr>
       <w:r>
         <w:rPr>
           <w:rStyle w:val="Ttulo3Car"/>
+          <w:b/>
+          <w:bCs/>
           <w:i w:val="0"/>
           <w:iCs w:val="0"/>
         </w:rPr>
-        <w:t>tethered payload.</w:t>
+        <w:t xml:space="preserve">Monte-Carlo Tree Search for Manipulation </w:t>
+      </w:r>
+      <w:r>
+        <w:rPr>
+          <w:rStyle w:val="Ttulo3Car"/>
+        </w:rPr>
+        <w:tab/>
       </w:r>
     </w:p>
     <w:p>
@@ -617,7 +571,7 @@
           <w:i w:val="0"/>
           <w:iCs w:val="0"/>
         </w:rPr>
-        <w:t>Combined behavioural cloning, adversarial and property-driven training with controller-level verification (Vehicle + Marabou) and reachability analysis (CORA).</w:t>
+        <w:t>Explored the use of Monte-Carlo Tree Search (MCTS) for manipulation in Gymnasium benchmarks.</w:t>
       </w:r>
     </w:p>
     <w:p>
@@ -633,8 +587,6 @@
         <w:jc w:val="left"/>
         <w:rPr>
           <w:rStyle w:val="Ttulo3Car"/>
-          <w:i w:val="0"/>
-          <w:iCs w:val="0"/>
         </w:rPr>
       </w:pPr>
       <w:r>
@@ -643,96 +595,7 @@
           <w:i w:val="0"/>
           <w:iCs w:val="0"/>
         </w:rPr>
-        <w:t>Preparing for submission to SAIV 2026.</w:t>
-      </w:r>
-    </w:p>
-    <w:p>
-      <w:pPr>
-        <w:tabs>
-          <w:tab w:val="right" w:pos="9923"/>
-        </w:tabs>
-        <w:jc w:val="left"/>
-        <w:rPr>
-          <w:rStyle w:val="Ttulo3Car"/>
-          <w:b/>
-          <w:bCs/>
-          <w:i w:val="0"/>
-          <w:iCs w:val="0"/>
-        </w:rPr>
-      </w:pPr>
-    </w:p>
-    <w:p>
-      <w:pPr>
-        <w:tabs>
-          <w:tab w:val="right" w:pos="9923"/>
-        </w:tabs>
-        <w:jc w:val="left"/>
-        <w:rPr>
-          <w:rStyle w:val="Ttulo3Car"/>
-          <w:i w:val="0"/>
-          <w:iCs w:val="0"/>
-        </w:rPr>
-      </w:pPr>
-      <w:r>
-        <w:rPr>
-          <w:rStyle w:val="Ttulo3Car"/>
-        </w:rPr>
-        <w:t>LAAS-CNRS</w:t>
-      </w:r>
-      <w:r>
-        <w:rPr>
-          <w:rStyle w:val="Ttulo3Car"/>
-        </w:rPr>
-        <w:t xml:space="preserve"> and New York University (NYU), Remote</w:t>
-      </w:r>
-      <w:r>
-        <w:rPr>
-          <w:rStyle w:val="Ttulo3Car"/>
-        </w:rPr>
-        <w:tab/>
-      </w:r>
-      <w:r>
-        <w:rPr>
-          <w:rStyle w:val="Ttulo3Car"/>
-        </w:rPr>
-        <w:t xml:space="preserve">April </w:t>
-      </w:r>
-      <w:r>
-        <w:rPr>
-          <w:rStyle w:val="Ttulo3Car"/>
-        </w:rPr>
-        <w:t>– May 2025</w:t>
-      </w:r>
-    </w:p>
-    <w:p>
-      <w:pPr>
-        <w:tabs>
-          <w:tab w:val="right" w:pos="9923"/>
-        </w:tabs>
-        <w:jc w:val="left"/>
-        <w:rPr>
-          <w:rStyle w:val="Ttulo3Car"/>
-          <w:b/>
-          <w:bCs/>
-          <w:i w:val="0"/>
-          <w:iCs w:val="0"/>
-        </w:rPr>
-      </w:pPr>
-      <w:r>
-        <w:rPr>
-          <w:rStyle w:val="Ttulo3Car"/>
-          <w:b/>
-          <w:bCs/>
-          <w:i w:val="0"/>
-          <w:iCs w:val="0"/>
-        </w:rPr>
-        <w:t xml:space="preserve">Monte-Carlo Tree Search for Manipulation </w:t>
-      </w:r>
-      <w:r>
-        <w:rPr>
-          <w:rStyle w:val="Ttulo3Car"/>
-        </w:rPr>
-        <w:tab/>
+        <w:t xml:space="preserve">Implemented and researched the integration of RL concepts with Monte-Carlo Tree Search for discretised manipulation scenarios.</w:t>
       </w:r>
     </w:p>
     <w:p>
@@ -748,8 +611,6 @@
         <w:jc w:val="left"/>
         <w:rPr>
           <w:rStyle w:val="Ttulo3Car"/>
-          <w:i w:val="0"/>
-          <w:iCs w:val="0"/>
         </w:rPr>
       </w:pPr>
       <w:r>
@@ -758,408 +619,67 @@
           <w:i w:val="0"/>
           <w:iCs w:val="0"/>
         </w:rPr>
-        <w:t>Explor</w:t>
-      </w:r>
-      <w:r>
-        <w:rPr>
-          <w:rStyle w:val="Ttulo3Car"/>
-          <w:i w:val="0"/>
-          <w:iCs w:val="0"/>
-        </w:rPr>
-        <w:t>ed the use of Monte-Carlo Tree Search (MCTS) for manipulation in Gymnasium benchmarks.</w:t>
-      </w:r>
-    </w:p>
-    <w:p>
-      <w:pPr>
-        <w:pStyle w:val="Prrafodelista"/>
-        <w:numPr>
-          <w:ilvl w:val="0"/>
-          <w:numId w:val="43"/>
-        </w:numPr>
+        <w:t xml:space="preserve">Supervision: Dr. Nicolas Mansard (LAAS-CNRS) and Prof. Ludovic Righetti (NYU).</w:t>
+      </w:r>
+    </w:p>
+    <w:p>
+      <w:pPr>
         <w:tabs>
           <w:tab w:val="right" w:pos="9923"/>
         </w:tabs>
         <w:jc w:val="left"/>
         <w:rPr>
-          <w:rStyle w:val="Ttulo3Car"/>
-        </w:rPr>
-      </w:pPr>
-      <w:r>
-        <w:rPr>
-          <w:rStyle w:val="Ttulo3Car"/>
-          <w:i w:val="0"/>
-          <w:iCs w:val="0"/>
-        </w:rPr>
-        <w:t>Implemented and researched the integration of RL concepts, Monte-Carlo simulations and tree search algorithms with discretised manipulation scenarios.</w:t>
-      </w:r>
-    </w:p>
-    <w:p>
-      <w:pPr>
-        <w:pStyle w:val="Prrafodelista"/>
-        <w:numPr>
-          <w:ilvl w:val="0"/>
-          <w:numId w:val="43"/>
-        </w:numPr>
+          <w:b/>
+          <w:bCs/>
+        </w:rPr>
+      </w:pPr>
+    </w:p>
+    <w:p>
+      <w:pPr>
         <w:tabs>
           <w:tab w:val="right" w:pos="9923"/>
         </w:tabs>
         <w:jc w:val="left"/>
         <w:rPr>
-          <w:rStyle w:val="Ttulo3Car"/>
-        </w:rPr>
-      </w:pPr>
-      <w:r>
-        <w:rPr>
-          <w:rStyle w:val="Ttulo3Car"/>
-          <w:i w:val="0"/>
-          <w:iCs w:val="0"/>
-        </w:rPr>
-        <w:t>Supervision: Dr. Nicolas Mansard (LAAS-CNRS) and Prof. Ludovic Righetti (NYU)</w:t>
-      </w:r>
-    </w:p>
-    <w:p>
-      <w:pPr>
-        <w:tabs>
-          <w:tab w:val="right" w:pos="9923"/>
-        </w:tabs>
-        <w:jc w:val="left"/>
-        <w:rPr>
           <w:b/>
           <w:bCs/>
         </w:rPr>
       </w:pPr>
-    </w:p>
-    <w:p>
-      <w:pPr>
-        <w:tabs>
-          <w:tab w:val="right" w:pos="9923"/>
-        </w:tabs>
-        <w:jc w:val="left"/>
-        <w:rPr>
-          <w:rStyle w:val="Ttulo3Car"/>
-          <w:i w:val="0"/>
-          <w:iCs w:val="0"/>
-        </w:rPr>
-      </w:pPr>
-      <w:r>
-        <w:rPr>
-          <w:rStyle w:val="Ttulo3Car"/>
-        </w:rPr>
-        <w:t>The University of Edinburgh, UK</w:t>
-      </w:r>
-      <w:r>
-        <w:rPr>
-          <w:rStyle w:val="Ttulo3Car"/>
-        </w:rPr>
-        <w:tab/>
-      </w:r>
-      <w:r>
-        <w:rPr>
-          <w:rStyle w:val="Ttulo3Car"/>
-        </w:rPr>
-        <w:t>2023 - 2025</w:t>
-      </w:r>
-    </w:p>
-    <w:p>
-      <w:pPr>
-        <w:pStyle w:val="Ttulo2"/>
-        <w:tabs>
-          <w:tab w:val="right" w:pos="9923"/>
-        </w:tabs>
-        <w:jc w:val="left"/>
-        <w:rPr>
-          <w:b w:val="0"/>
-          <w:bCs w:val="0"/>
+      <w:r>
+        <w:rPr>
           <w:i/>
           <w:iCs/>
-          <w:lang w:val="en-US" w:eastAsia="es-ES_tradnl"/>
-        </w:rPr>
-      </w:pPr>
-      <w:proofErr w:type="spellStart"/>
-      <w:r>
-        <w:rPr>
-          <w:lang w:val="en-US" w:eastAsia="es-ES_tradnl"/>
-        </w:rPr>
-        <w:t>Optimisation</w:t>
-      </w:r>
-      <w:proofErr w:type="spellEnd"/>
-      <w:r>
-        <w:rPr>
-          <w:lang w:val="en-US" w:eastAsia="es-ES_tradnl"/>
-        </w:rPr>
-        <w:t>-Based Manipulation Planning in Convex Decompositions of C-</w:t>
-      </w:r>
-      <w:r>
-        <w:rPr>
-          <w:lang w:val="en-US" w:eastAsia="es-ES_tradnl"/>
-        </w:rPr>
-        <w:t>free</w:t>
-      </w:r>
-    </w:p>
-    <w:p>
-      <w:pPr>
-        <w:pStyle w:val="Prrafodelista"/>
-        <w:numPr>
-          <w:ilvl w:val="0"/>
-          <w:numId w:val="18"/>
-        </w:numPr>
+        </w:rPr>
+        <w:t>The University of Edinburgh, UK</w:t>
+      </w:r>
+      <w:r>
+        <w:tab/>
+        <w:t>2024 – 2025</w:t>
+      </w:r>
+    </w:p>
+    <w:p>
+      <w:pPr>
         <w:jc w:val="left"/>
         <w:rPr>
-          <w:lang w:val="en-US" w:eastAsia="es-ES_tradnl"/>
-        </w:rPr>
-      </w:pPr>
-      <w:r>
-        <w:rPr>
-          <w:lang w:val="en-US" w:eastAsia="es-ES_tradnl"/>
-        </w:rPr>
-        <w:t>Master’s Thesis, de</w:t>
-      </w:r>
-      <w:r>
-        <w:rPr>
-          <w:lang w:val="en-US" w:eastAsia="es-ES_tradnl"/>
-        </w:rPr>
-        <w:t>v</w:t>
-      </w:r>
-      <w:r>
-        <w:rPr>
-          <w:lang w:val="en-US" w:eastAsia="es-ES_tradnl"/>
-        </w:rPr>
-        <w:t xml:space="preserve">eloping a novel manipulation planning pipeline based </w:t>
-      </w:r>
-      <w:r>
-        <w:rPr>
-          <w:lang w:val="en-US" w:eastAsia="es-ES_tradnl"/>
-        </w:rPr>
-        <w:t>o</w:t>
-      </w:r>
-      <w:r>
-        <w:rPr>
-          <w:lang w:val="en-US" w:eastAsia="es-ES_tradnl"/>
-        </w:rPr>
-        <w:t xml:space="preserve">n convex </w:t>
-      </w:r>
-      <w:proofErr w:type="spellStart"/>
-      <w:r>
-        <w:rPr>
-          <w:lang w:val="en-US" w:eastAsia="es-ES_tradnl"/>
-        </w:rPr>
-        <w:t>optimi</w:t>
-      </w:r>
-      <w:r>
-        <w:rPr>
-          <w:lang w:val="en-US" w:eastAsia="es-ES_tradnl"/>
-        </w:rPr>
-        <w:t>s</w:t>
-      </w:r>
-      <w:r>
-        <w:rPr>
-          <w:lang w:val="en-US" w:eastAsia="es-ES_tradnl"/>
-        </w:rPr>
-        <w:t>ation</w:t>
-      </w:r>
-      <w:proofErr w:type="spellEnd"/>
-      <w:r>
-        <w:rPr>
-          <w:lang w:val="en-US" w:eastAsia="es-ES_tradnl"/>
-        </w:rPr>
-        <w:t>.</w:t>
-      </w:r>
-    </w:p>
-    <w:p>
-      <w:pPr>
-        <w:pStyle w:val="Prrafodelista"/>
-        <w:numPr>
-          <w:ilvl w:val="0"/>
-          <w:numId w:val="18"/>
-        </w:numPr>
-        <w:jc w:val="left"/>
-        <w:rPr>
-          <w:lang w:val="en-US" w:eastAsia="es-ES_tradnl"/>
-        </w:rPr>
-      </w:pPr>
-      <w:r>
-        <w:rPr>
-          <w:lang w:val="en-US" w:eastAsia="es-ES_tradnl"/>
-        </w:rPr>
-        <w:t xml:space="preserve">Integrated the Drake robotics toolbox for modelling, </w:t>
-      </w:r>
-      <w:proofErr w:type="spellStart"/>
-      <w:r>
-        <w:rPr>
-          <w:lang w:val="en-US" w:eastAsia="es-ES_tradnl"/>
-        </w:rPr>
-        <w:t>optimisation</w:t>
-      </w:r>
-      <w:proofErr w:type="spellEnd"/>
-      <w:r>
-        <w:rPr>
-          <w:lang w:val="en-US" w:eastAsia="es-ES_tradnl"/>
-        </w:rPr>
-        <w:t xml:space="preserve"> and </w:t>
-      </w:r>
-      <w:proofErr w:type="spellStart"/>
-      <w:proofErr w:type="gramStart"/>
-      <w:r>
-        <w:rPr>
-          <w:lang w:val="en-US" w:eastAsia="es-ES_tradnl"/>
-        </w:rPr>
-        <w:t>visualisation</w:t>
-      </w:r>
-      <w:proofErr w:type="spellEnd"/>
-      <w:r>
-        <w:rPr>
-          <w:lang w:val="en-US" w:eastAsia="es-ES_tradnl"/>
-        </w:rPr>
-        <w:t>;</w:t>
-      </w:r>
-      <w:proofErr w:type="gramEnd"/>
-      <w:r>
-        <w:rPr>
-          <w:lang w:val="en-US" w:eastAsia="es-ES_tradnl"/>
-        </w:rPr>
-        <w:t xml:space="preserve"> applied concepts from robot kinematics, algebraic rotations and trajectory </w:t>
-      </w:r>
-      <w:proofErr w:type="spellStart"/>
-      <w:r>
-        <w:rPr>
-          <w:lang w:val="en-US" w:eastAsia="es-ES_tradnl"/>
-        </w:rPr>
-        <w:t>optimisation</w:t>
-      </w:r>
-      <w:proofErr w:type="spellEnd"/>
-      <w:r>
-        <w:rPr>
-          <w:lang w:val="en-US" w:eastAsia="es-ES_tradnl"/>
-        </w:rPr>
-        <w:t>.</w:t>
-      </w:r>
-    </w:p>
-    <w:p>
-      <w:pPr>
-        <w:pStyle w:val="Prrafodelista"/>
-        <w:numPr>
-          <w:ilvl w:val="0"/>
-          <w:numId w:val="18"/>
-        </w:numPr>
-        <w:jc w:val="left"/>
-        <w:rPr>
-          <w:lang w:val="en-US" w:eastAsia="es-ES_tradnl"/>
-        </w:rPr>
-      </w:pPr>
-      <w:r>
-        <w:rPr>
-          <w:lang w:val="en-US" w:eastAsia="es-ES_tradnl"/>
-        </w:rPr>
-        <w:t xml:space="preserve">Preparing for submission </w:t>
-      </w:r>
-      <w:r>
-        <w:rPr>
-          <w:lang w:val="en-US" w:eastAsia="es-ES_tradnl"/>
-        </w:rPr>
-        <w:t>to</w:t>
-      </w:r>
-      <w:r>
-        <w:rPr>
-          <w:lang w:val="en-US" w:eastAsia="es-ES_tradnl"/>
-        </w:rPr>
-        <w:t xml:space="preserve"> </w:t>
-      </w:r>
-      <w:r>
-        <w:rPr>
-          <w:lang w:val="en-US" w:eastAsia="es-ES_tradnl"/>
-        </w:rPr>
-        <w:t>IROS</w:t>
-      </w:r>
-      <w:r>
-        <w:rPr>
-          <w:lang w:val="en-US" w:eastAsia="es-ES_tradnl"/>
-        </w:rPr>
-        <w:t xml:space="preserve"> 2026.</w:t>
-      </w:r>
-    </w:p>
-    <w:p>
-      <w:pPr>
-        <w:pStyle w:val="Prrafodelista"/>
-        <w:numPr>
-          <w:ilvl w:val="0"/>
-          <w:numId w:val="18"/>
-        </w:numPr>
-        <w:jc w:val="left"/>
-        <w:rPr>
-          <w:lang w:val="en-US" w:eastAsia="es-ES_tradnl"/>
-        </w:rPr>
-      </w:pPr>
-      <w:r>
-        <w:rPr>
-          <w:lang w:val="en-US" w:eastAsia="es-ES_tradnl"/>
-        </w:rPr>
-        <w:t>Supervision: Dr. Steve Tonneau</w:t>
-      </w:r>
-    </w:p>
-    <w:p>
-      <w:pPr>
-        <w:pStyle w:val="Prrafodelista"/>
-        <w:jc w:val="left"/>
-        <w:rPr>
-          <w:lang w:val="en-US" w:eastAsia="es-ES_tradnl"/>
-        </w:rPr>
-      </w:pPr>
-    </w:p>
-    <w:p>
-      <w:pPr>
-        <w:tabs>
-          <w:tab w:val="right" w:pos="9923"/>
-        </w:tabs>
-        <w:jc w:val="left"/>
+          <w:i/>
+          <w:iCs/>
+        </w:rPr>
+      </w:pPr>
+      <w:r>
         <w:rPr>
           <w:b/>
           <w:bCs/>
         </w:rPr>
-      </w:pPr>
-      <w:r>
-        <w:rPr>
-          <w:i/>
-          <w:iCs/>
-        </w:rPr>
-        <w:t>The University of Edinburgh, UK</w:t>
-      </w:r>
-      <w:r>
-        <w:rPr>
-          <w:i/>
-          <w:iCs/>
-        </w:rPr>
-        <w:tab/>
-        <w:t>2024 - 2025</w:t>
-      </w:r>
-    </w:p>
-    <w:p>
-      <w:pPr>
+        <w:t>Selected Machine Learning Projects</w:t>
+      </w:r>
+    </w:p>
+    <w:p>
+      <w:pPr>
+        <w:spacing w:after="60"/>
         <w:jc w:val="left"/>
-        <w:rPr>
-          <w:i/>
-          <w:iCs/>
-        </w:rPr>
-      </w:pPr>
-      <w:r>
-        <w:rPr>
-          <w:b/>
-          <w:bCs/>
-        </w:rPr>
-        <w:t>Selected Machine Learning Projects</w:t>
-      </w:r>
-    </w:p>
-    <w:p>
-      <w:pPr>
-        <w:spacing w:after="60"/>
-        <w:ind w:left="1418" w:hanging="1418"/>
-        <w:jc w:val="left"/>
-      </w:pPr>
-      <w:r>
-        <w:t xml:space="preserve">Spring 2025 </w:t>
-      </w:r>
-      <w:r>
-        <w:tab/>
-        <w:t xml:space="preserve">Designed and evaluated segmentation models (U-Net, CLIP-based, Autoencoder) for pet image segmentation, incorporating robustness testing and an </w:t>
+      </w:pPr>
+      <w:r>
+        <w:t xml:space="preserve">Pet image segmentation (U-Net, CLIP, Autoencoder) with an </w:t>
       </w:r>
       <w:hyperlink r:id="rId9" w:history="1">
         <w:r>
@@ -1170,71 +690,118 @@
         </w:r>
       </w:hyperlink>
       <w:r>
-        <w:t>.</w:t>
-      </w:r>
-    </w:p>
-    <w:p>
-      <w:pPr>
-        <w:tabs>
-          <w:tab w:val="left" w:pos="1560"/>
-        </w:tabs>
+        <w:t xml:space="preserve">; real-time human activity recognition from wearable sensors (Android app); occluded-sheep detection with transfer learning (Faster R-CNN, SSD).</w:t>
+      </w:r>
+    </w:p>
+    <w:p>
+      <w:pPr>
+        <w:pStyle w:val="Prrafodelista"/>
+        <w:jc w:val="left"/>
+        <w:rPr>
+          <w:lang w:val="en-US" w:eastAsia="es-ES_tradnl"/>
+        </w:rPr>
+      </w:pPr>
+    </w:p>
+    <w:p>
+      <w:pPr>
+        <w:pStyle w:val="Ttulo1"/>
+      </w:pPr>
+      <w:r>
+        <w:t xml:space="preserve">SCHOOLS, TALKS AND EVENTS</w:t>
+      </w:r>
+    </w:p>
+    <w:p>
+      <w:pPr>
         <w:spacing w:after="60"/>
-        <w:ind w:left="1418" w:hanging="1418"/>
+        <w:ind w:left="1134" w:hanging="1134"/>
         <w:jc w:val="left"/>
       </w:pPr>
       <w:r>
-        <w:t xml:space="preserve">Fall 2024 </w:t>
-      </w:r>
-      <w:r>
+        <w:t xml:space="preserve">Oct. 2026</w:t>
         <w:tab/>
-        <w:t xml:space="preserve">Built a deep learning-based human activity recognition system using wearable sensors (Thingy &amp; </w:t>
-      </w:r>
-      <w:proofErr w:type="spellStart"/>
-      <w:r>
-        <w:t>Respeck</w:t>
-      </w:r>
-      <w:proofErr w:type="spellEnd"/>
-      <w:r>
-        <w:t>), including sleep analysis and real-time classification via an Android app.</w:t>
-      </w:r>
-    </w:p>
-    <w:p>
-      <w:pPr>
-        <w:tabs>
-          <w:tab w:val="left" w:pos="1560"/>
-        </w:tabs>
+      </w:r>
+      <w:r>
+        <w:rPr>
+          <w:b/>
+          <w:bCs/>
+        </w:rPr>
+        <w:t xml:space="preserve">Rock Climbing Robots Hackathon</w:t>
+      </w:r>
+      <w:r>
+        <w:t xml:space="preserve">, Bordeaux: team of six (CDT-D2AIR, LAAS-CNRS).</w:t>
+      </w:r>
+    </w:p>
+    <w:p>
+      <w:pPr>
         <w:spacing w:after="60"/>
-        <w:ind w:left="1418" w:hanging="1418"/>
+        <w:ind w:left="1134" w:hanging="1134"/>
         <w:jc w:val="left"/>
-        <w:rPr>
-          <w:lang w:eastAsia="es-ES_tradnl"/>
-        </w:rPr>
-      </w:pPr>
-      <w:r>
-        <w:t>Spring 2024</w:t>
-      </w:r>
-      <w:r>
+      </w:pPr>
+      <w:r>
+        <w:t xml:space="preserve">Sep. 2026</w:t>
         <w:tab/>
       </w:r>
       <w:r>
-        <w:t>Implemented object detection pipelines using transfer learning (Faster R-CNN, SSD) to improve the detection of occluded sheep.</w:t>
+        <w:rPr>
+          <w:b/>
+          <w:bCs/>
+        </w:rPr>
+        <w:t xml:space="preserve">IEEE RAS Summer School on Cognitive Robotics</w:t>
+      </w:r>
+      <w:r>
+        <w:t xml:space="preserve">, Germany: research pitch.</w:t>
+      </w:r>
+    </w:p>
+    <w:p>
+      <w:pPr>
+        <w:spacing w:after="60"/>
+        <w:ind w:left="1134" w:hanging="1134"/>
+        <w:jc w:val="left"/>
+      </w:pPr>
+      <w:r>
+        <w:t xml:space="preserve">Aug. 2026</w:t>
+        <w:tab/>
+      </w:r>
+      <w:r>
+        <w:rPr>
+          <w:b/>
+          <w:bCs/>
+        </w:rPr>
+        <w:t xml:space="preserve">IPAB Workshop</w:t>
+      </w:r>
+      <w:r>
+        <w:t xml:space="preserve">, UoE: talk on convex decompositions of C-free and NLP sampling.</w:t>
+      </w:r>
+    </w:p>
+    <w:p>
+      <w:pPr>
+        <w:spacing w:after="60"/>
+        <w:ind w:left="1134" w:hanging="1134"/>
+        <w:jc w:val="left"/>
+      </w:pPr>
+      <w:r>
+        <w:t xml:space="preserve">Feb. 2026</w:t>
+        <w:tab/>
+      </w:r>
+      <w:r>
+        <w:rPr>
+          <w:b/>
+          <w:bCs/>
+        </w:rPr>
+        <w:t xml:space="preserve">ROMANDIC Winter School</w:t>
+      </w:r>
+      <w:r>
+        <w:t xml:space="preserve"> on deformable object manipulation, Slovenia: poster and pitch.</w:t>
       </w:r>
     </w:p>
     <w:p>
       <w:pPr>
         <w:pStyle w:val="Ttulo1"/>
-      </w:pPr>
-      <w:r>
-        <w:lastRenderedPageBreak/>
-        <w:t xml:space="preserve">TEACHING AND </w:t>
-      </w:r>
-      <w:r>
-        <w:t>WORK EXPERIENCE</w:t>
-      </w:r>
-      <w:r>
+        <w:pageBreakBefore/>
+      </w:pPr>
+      <w:r>
+        <w:t xml:space="preserve">TEACHING AND WORK EXPERIENCE</w:t>
         <w:tab/>
-      </w:r>
-      <w:r>
         <w:tab/>
       </w:r>
     </w:p>
@@ -1248,43 +815,17 @@
         <w:rPr>
           <w:rStyle w:val="Ttulo2Car"/>
         </w:rPr>
-        <w:t>Teaching Assistant in Robotics</w:t>
-      </w:r>
-      <w:r>
-        <w:rPr>
-          <w:rStyle w:val="Ttulo2Car"/>
-        </w:rPr>
-        <w:t xml:space="preserve"> Design Project</w:t>
-      </w:r>
-      <w:r>
-        <w:rPr>
-          <w:rStyle w:val="Ttulo2Car"/>
-        </w:rPr>
-        <w:t xml:space="preserve"> </w:t>
+        <w:t xml:space="preserve">Teaching Assistant in Robotics </w:t>
       </w:r>
       <w:r>
         <w:rPr>
           <w:rStyle w:val="Ttulo3Car"/>
         </w:rPr>
-        <w:t>–</w:t>
-      </w:r>
-      <w:r>
-        <w:rPr>
-          <w:rStyle w:val="Ttulo3Car"/>
-        </w:rPr>
-        <w:t xml:space="preserve"> UoE, </w:t>
-      </w:r>
-      <w:r>
-        <w:rPr>
-          <w:rStyle w:val="Ttulo3Car"/>
-        </w:rPr>
-        <w:t>School of Informatics</w:t>
+        <w:t xml:space="preserve">– UoE, School of Informatics</w:t>
       </w:r>
       <w:r>
         <w:tab/>
-      </w:r>
-      <w:r>
-        <w:t>Jan. 2026 – Present</w:t>
+        <w:t>Fall 2025 &amp; Fall 2026</w:t>
       </w:r>
     </w:p>
     <w:p>
@@ -1305,49 +846,7 @@
         </w:rPr>
       </w:pPr>
       <w:r>
-        <w:t>System Design Project</w:t>
-      </w:r>
-      <w:r>
-        <w:t xml:space="preserve"> (</w:t>
-      </w:r>
-      <w:r>
-        <w:t>INFR09032</w:t>
-      </w:r>
-      <w:r>
-        <w:t xml:space="preserve">), </w:t>
-      </w:r>
-      <w:r>
-        <w:t>UG3</w:t>
-      </w:r>
-      <w:r>
-        <w:t xml:space="preserve"> Level: </w:t>
-      </w:r>
-      <w:r>
-        <w:t>Coursework Marker and Office Hours</w:t>
-      </w:r>
-      <w:r>
-        <w:t xml:space="preserve">. </w:t>
-      </w:r>
-      <w:r>
-        <w:t>Robot Design</w:t>
-      </w:r>
-      <w:r>
-        <w:t xml:space="preserve">, </w:t>
-      </w:r>
-      <w:r>
-        <w:t xml:space="preserve">Machine Learning and Vision in Embedded Systems </w:t>
-      </w:r>
-      <w:r>
-        <w:t>(</w:t>
-      </w:r>
-      <w:r>
-        <w:t>Raspberry Pi</w:t>
-      </w:r>
-      <w:r>
-        <w:t>)</w:t>
-      </w:r>
-      <w:r>
-        <w:t xml:space="preserve">. </w:t>
+        <w:t xml:space="preserve">Advanced Robotics (INFR11213), MSc level: lab demonstrator, TA and marker for robot kinematics, path planning, trajectory optimisation and control.</w:t>
       </w:r>
     </w:p>
     <w:p>
@@ -1370,31 +869,17 @@
         <w:rPr>
           <w:rStyle w:val="Ttulo2Car"/>
         </w:rPr>
-        <w:t xml:space="preserve">Teaching Assistant in Robotics </w:t>
+        <w:t xml:space="preserve">Teaching Assistant in Robotics Design Project </w:t>
       </w:r>
       <w:r>
         <w:rPr>
           <w:rStyle w:val="Ttulo3Car"/>
         </w:rPr>
-        <w:t xml:space="preserve">– </w:t>
-      </w:r>
-      <w:r>
-        <w:rPr>
-          <w:rStyle w:val="Ttulo3Car"/>
-        </w:rPr>
-        <w:t>UoE</w:t>
-      </w:r>
-      <w:r>
-        <w:rPr>
-          <w:rStyle w:val="Ttulo3Car"/>
-        </w:rPr>
-        <w:t>, School of Informatics</w:t>
+        <w:t xml:space="preserve">– UoE, School of Informatics</w:t>
       </w:r>
       <w:r>
         <w:tab/>
-      </w:r>
-      <w:r>
-        <w:t>Fall 2025</w:t>
+        <w:t>Spring 2026</w:t>
       </w:r>
     </w:p>
     <w:p>
@@ -1415,7 +900,7 @@
         </w:rPr>
       </w:pPr>
       <w:r>
-        <w:t>Advanced Robotics (INFR11213), MSc Level: Lab demonstrator, TA and Marker. Robot Kinematics, Path Planning, Trajectory Optimisation and Control.</w:t>
+        <w:t xml:space="preserve">System Design Project (INFR09032), UG3 level: coursework marking and office hours on robot design, machine learning and vision in embedded systems (Raspberry Pi).</w:t>
       </w:r>
     </w:p>
     <w:p>
@@ -1489,25 +974,7 @@
         <w:rPr>
           <w:shd w:val="clear" w:color="auto" w:fill="FFFFFF"/>
         </w:rPr>
-        <w:t xml:space="preserve"> Raspberry Pi, Arduino</w:t>
-      </w:r>
-      <w:r>
-        <w:rPr>
-          <w:shd w:val="clear" w:color="auto" w:fill="FFFFFF"/>
-        </w:rPr>
-        <w:t xml:space="preserve"> and </w:t>
-      </w:r>
-      <w:r>
-        <w:rPr>
-          <w:shd w:val="clear" w:color="auto" w:fill="FFFFFF"/>
-        </w:rPr>
-        <w:t>ROS2 basics</w:t>
-      </w:r>
-      <w:r>
-        <w:rPr>
-          <w:shd w:val="clear" w:color="auto" w:fill="FFFFFF"/>
-        </w:rPr>
-        <w:t>.</w:t>
+        <w:t xml:space="preserve"> Raspberry Pi, Arduino and ROS2 basics.</w:t>
       </w:r>
     </w:p>
     <w:p>
@@ -1527,13 +994,7 @@
         <w:rPr>
           <w:shd w:val="clear" w:color="auto" w:fill="FFFFFF"/>
         </w:rPr>
-        <w:t xml:space="preserve">Assisting Robotics undergraduates </w:t>
-      </w:r>
-      <w:r>
-        <w:rPr>
-          <w:shd w:val="clear" w:color="auto" w:fill="FFFFFF"/>
-        </w:rPr>
-        <w:t>in robot-building and using makerspace resources.</w:t>
+        <w:t xml:space="preserve">Assisting Robotics undergraduates in robot-building and using makerspace resources.</w:t>
       </w:r>
     </w:p>
     <w:p>
@@ -1572,13 +1033,7 @@
         <w:rPr>
           <w:rStyle w:val="Ttulo3Car"/>
         </w:rPr>
-        <w:t xml:space="preserve">– </w:t>
-      </w:r>
-      <w:r>
-        <w:rPr>
-          <w:rStyle w:val="Ttulo3Car"/>
-        </w:rPr>
-        <w:t>J.P. Morgan Chase &amp; Co., UK</w:t>
+        <w:t xml:space="preserve">– J.P. Morgan Chase &amp; Co., UK</w:t>
       </w:r>
       <w:r>
         <w:rPr>
@@ -1617,31 +1072,30 @@
     </w:p>
     <w:p>
       <w:pPr>
+        <w:pStyle w:val="Prrafodelista"/>
         <w:jc w:val="left"/>
-        <w:rPr>
-          <w:rStyle w:val="Ttulo2Car"/>
-          <w:b w:val="0"/>
-          <w:bCs w:val="0"/>
-        </w:rPr>
-      </w:pPr>
+      </w:pPr>
+    </w:p>
+    <w:p>
+      <w:pPr>
+        <w:pStyle w:val="Ttulo1"/>
+      </w:pPr>
+      <w:r>
+        <w:t xml:space="preserve">SELECTED TECHNICAL PROJECTS IN R&amp;D</w:t>
+      </w:r>
     </w:p>
     <w:p>
       <w:pPr>
         <w:tabs>
           <w:tab w:val="right" w:pos="9923"/>
         </w:tabs>
+        <w:jc w:val="left"/>
       </w:pPr>
       <w:r>
         <w:rPr>
           <w:rStyle w:val="Ttulo2Car"/>
         </w:rPr>
-        <w:t>Teaching Support Provider</w:t>
-      </w:r>
-      <w:r>
-        <w:rPr>
-          <w:rStyle w:val="Ttulo2Car"/>
-        </w:rPr>
-        <w:t xml:space="preserve"> in Functional Programming </w:t>
+        <w:t xml:space="preserve">Payload Software and Electrical Lead </w:t>
       </w:r>
       <w:r>
         <w:rPr>
@@ -1651,90 +1105,11 @@
           <w:i/>
           <w:iCs/>
         </w:rPr>
-        <w:t>– UoE, School of Informatics</w:t>
+        <w:t>– Endeavour Rockets</w:t>
       </w:r>
       <w:r>
         <w:tab/>
-        <w:t>Fall 2022</w:t>
-      </w:r>
-    </w:p>
-    <w:p>
-      <w:pPr>
-        <w:pStyle w:val="Prrafodelista"/>
-        <w:numPr>
-          <w:ilvl w:val="0"/>
-          <w:numId w:val="27"/>
-        </w:numPr>
-        <w:tabs>
-          <w:tab w:val="right" w:pos="9781"/>
-        </w:tabs>
-        <w:jc w:val="left"/>
-      </w:pPr>
-      <w:r>
-        <w:t>Lead a weekly lab to aid 1</w:t>
-      </w:r>
-      <w:r>
-        <w:rPr>
-          <w:vertAlign w:val="superscript"/>
-        </w:rPr>
-        <w:t>st</w:t>
-      </w:r>
-      <w:r>
-        <w:t xml:space="preserve"> year students in their learning of Haskell and Computational Logic</w:t>
-      </w:r>
-      <w:r>
-        <w:t>.</w:t>
-      </w:r>
-    </w:p>
-    <w:p>
-      <w:pPr>
-        <w:pStyle w:val="Prrafodelista"/>
-        <w:jc w:val="left"/>
-      </w:pPr>
-    </w:p>
-    <w:p>
-      <w:pPr>
-        <w:pStyle w:val="Ttulo1"/>
-      </w:pPr>
-      <w:r>
-        <w:t>SELECTED TECHNICAL PROJECTS</w:t>
-      </w:r>
-      <w:r>
-        <w:t xml:space="preserve"> IN R&amp;D</w:t>
-      </w:r>
-    </w:p>
-    <w:p>
-      <w:pPr>
-        <w:tabs>
-          <w:tab w:val="right" w:pos="9923"/>
-        </w:tabs>
-        <w:jc w:val="left"/>
-      </w:pPr>
-      <w:r>
-        <w:rPr>
-          <w:rStyle w:val="Ttulo2Car"/>
-        </w:rPr>
-        <w:t xml:space="preserve">Payload Software and Electrical Lead </w:t>
-      </w:r>
-      <w:r>
-        <w:rPr>
-          <w:rStyle w:val="Ttulo2Car"/>
-          <w:b w:val="0"/>
-          <w:bCs w:val="0"/>
-          <w:i/>
-          <w:iCs/>
-        </w:rPr>
-        <w:t>– Endeavour Rockets</w:t>
-      </w:r>
-      <w:r>
-        <w:tab/>
-        <w:t xml:space="preserve">Sep. 2022 – </w:t>
-      </w:r>
-      <w:r>
-        <w:t>Sep. 2024</w:t>
-      </w:r>
-      <w:r>
-        <w:t xml:space="preserve"> </w:t>
+        <w:t xml:space="preserve">Sep. 2022 – Sep. 2024 </w:t>
       </w:r>
     </w:p>
     <w:p>
@@ -1753,13 +1128,7 @@
         <w:rPr>
           <w:lang w:eastAsia="es-ES_tradnl"/>
         </w:rPr>
-        <w:t>Software and electronics lead for CanSat and 3U CubeSat payloads</w:t>
-      </w:r>
-      <w:r>
-        <w:rPr>
-          <w:lang w:eastAsia="es-ES_tradnl"/>
-        </w:rPr>
-        <w:t xml:space="preserve"> in a student-led team.</w:t>
+        <w:t xml:space="preserve">Software and electronics lead for CanSat and 3U CubeSat payloads in a student-led team.</w:t>
       </w:r>
     </w:p>
     <w:p>
@@ -1810,13 +1179,7 @@
         <w:rPr>
           <w:lang w:eastAsia="es-ES_tradnl"/>
         </w:rPr>
-        <w:t xml:space="preserve"> </w:t>
-      </w:r>
-      <w:r>
-        <w:rPr>
-          <w:lang w:eastAsia="es-ES_tradnl"/>
-        </w:rPr>
-        <w:t>place at Mach-23 competition; invited to Airbus CubeSat Day.</w:t>
+        <w:t xml:space="preserve"> place at Mach-23 competition; invited to Airbus CubeSat Day.</w:t>
       </w:r>
     </w:p>
     <w:p>
@@ -1840,19 +1203,7 @@
         <w:t>Other projects:</w:t>
       </w:r>
       <w:r>
-        <w:t xml:space="preserve"> Assistive laundry-folding robot; simulated drone delivery using A*</w:t>
-      </w:r>
-      <w:r>
-        <w:t xml:space="preserve"> algorithm</w:t>
-      </w:r>
-      <w:r>
-        <w:t>; ESA CanSat competition (</w:t>
-      </w:r>
-      <w:r>
-        <w:t xml:space="preserve">Microsatellite assembly, Embedded Sensors, </w:t>
-      </w:r>
-      <w:r>
-        <w:t>PCB, CAD, 3D printing).</w:t>
+        <w:t xml:space="preserve"> Assistive laundry-folding robot; simulated drone delivery using A* algorithm; ESA CanSat competition (microsatellite assembly, embedded sensors, PCB, CAD, 3D printing).</w:t>
       </w:r>
     </w:p>
     <w:p>
@@ -1869,6 +1220,193 @@
         <w:pStyle w:val="Ttulo1"/>
       </w:pPr>
       <w:r>
+        <w:t>AWARDS</w:t>
+      </w:r>
+    </w:p>
+    <w:p>
+      <w:pPr>
+        <w:pStyle w:val="Ttulo2"/>
+        <w:tabs>
+          <w:tab w:val="right" w:pos="9923"/>
+        </w:tabs>
+        <w:rPr>
+          <w:b w:val="0"/>
+          <w:bCs w:val="0"/>
+        </w:rPr>
+      </w:pPr>
+      <w:r>
+        <w:t>The Edinburgh Award: Makerspace Student Technician</w:t>
+      </w:r>
+      <w:r>
+        <w:rPr>
+          <w:b w:val="0"/>
+          <w:bCs w:val="0"/>
+        </w:rPr>
+        <w:t xml:space="preserve"> </w:t>
+        <w:tab/>
+        <w:t>Jun. 2024</w:t>
+      </w:r>
+    </w:p>
+    <w:p>
+      <w:pPr>
+        <w:jc w:val="left"/>
+      </w:pPr>
+      <w:r>
+        <w:t xml:space="preserve">Technical project, mentoring students and delivering workshops as a Makerspace Student Technician.</w:t>
+      </w:r>
+    </w:p>
+    <w:p>
+      <w:pPr>
+        <w:jc w:val="left"/>
+      </w:pPr>
+    </w:p>
+    <w:p>
+      <w:pPr>
+        <w:tabs>
+          <w:tab w:val="right" w:pos="9923"/>
+        </w:tabs>
+        <w:jc w:val="left"/>
+      </w:pPr>
+      <w:r>
+        <w:rPr>
+          <w:b/>
+          <w:bCs/>
+        </w:rPr>
+        <w:t xml:space="preserve">The Edinburgh Award: Leadership in Student Opportunities </w:t>
+        <w:tab/>
+      </w:r>
+      <w:r>
+        <w:t>Apr. 2023</w:t>
+      </w:r>
+    </w:p>
+    <w:p>
+      <w:pPr>
+        <w:jc w:val="left"/>
+        <w:rPr>
+          <w:lang w:val="en-US" w:eastAsia="es-ES_tradnl"/>
+        </w:rPr>
+      </w:pPr>
+      <w:r>
+        <w:t xml:space="preserve">Recognising leadership, communication, critical thinking, and digital literacy skills as UG3 Rep.</w:t>
+      </w:r>
+    </w:p>
+    <w:p>
+      <w:pPr>
+        <w:jc w:val="left"/>
+        <w:rPr>
+          <w:lang w:val="en-US"/>
+        </w:rPr>
+      </w:pPr>
+    </w:p>
+    <w:p>
+      <w:pPr>
+        <w:pStyle w:val="Ttulo2"/>
+        <w:tabs>
+          <w:tab w:val="right" w:pos="9923"/>
+        </w:tabs>
+        <w:rPr>
+          <w:b w:val="0"/>
+          <w:bCs w:val="0"/>
+          <w:lang w:val="en-US"/>
+        </w:rPr>
+      </w:pPr>
+      <w:r>
+        <w:rPr>
+          <w:lang w:val="en-US"/>
+        </w:rPr>
+        <w:t>1</w:t>
+      </w:r>
+      <w:r>
+        <w:rPr>
+          <w:vertAlign w:val="superscript"/>
+          <w:lang w:val="en-US"/>
+        </w:rPr>
+        <w:t>st</w:t>
+      </w:r>
+      <w:r>
+        <w:rPr>
+          <w:lang w:val="en-US"/>
+        </w:rPr>
+        <w:t xml:space="preserve"> Prize Overall in AdaHack Hackathon: Twitter Solves Rubik’s Cube</w:t>
+        <w:tab/>
+      </w:r>
+      <w:r>
+        <w:rPr>
+          <w:b w:val="0"/>
+          <w:bCs w:val="0"/>
+          <w:lang w:val="en-US"/>
+        </w:rPr>
+        <w:t>Nov. 2022</w:t>
+      </w:r>
+    </w:p>
+    <w:p>
+      <w:pPr>
+        <w:jc w:val="left"/>
+      </w:pPr>
+      <w:r>
+        <w:rPr>
+          <w:lang w:val="en-US"/>
+        </w:rPr>
+        <w:t xml:space="preserve">Used Twitter API to gather Rubik’s cube moves from the platform, showing the cube’s change in 3D.</w:t>
+      </w:r>
+    </w:p>
+    <w:p>
+      <w:pPr>
+        <w:tabs>
+          <w:tab w:val="right" w:pos="9781"/>
+        </w:tabs>
+        <w:jc w:val="left"/>
+        <w:rPr>
+          <w:lang w:val="en-US" w:eastAsia="es-ES_tradnl"/>
+        </w:rPr>
+      </w:pPr>
+    </w:p>
+    <w:p>
+      <w:pPr>
+        <w:tabs>
+          <w:tab w:val="right" w:pos="9923"/>
+        </w:tabs>
+        <w:jc w:val="left"/>
+      </w:pPr>
+      <w:r>
+        <w:rPr>
+          <w:b/>
+          <w:bCs/>
+        </w:rPr>
+        <w:t>Award of Academic Excellence</w:t>
+        <w:tab/>
+      </w:r>
+      <w:r>
+        <w:t>Jul. 2020</w:t>
+      </w:r>
+    </w:p>
+    <w:p>
+      <w:pPr>
+        <w:tabs>
+          <w:tab w:val="right" w:pos="9781"/>
+        </w:tabs>
+        <w:jc w:val="left"/>
+        <w:rPr>
+          <w:lang w:val="en-US" w:eastAsia="es-ES_tradnl"/>
+        </w:rPr>
+      </w:pPr>
+      <w:r>
+        <w:rPr>
+          <w:lang w:val="en-US" w:eastAsia="es-ES_tradnl"/>
+        </w:rPr>
+        <w:t xml:space="preserve">Top 10 in S/C de Tenerife (5,000+ students) over the last two years of high school and the EBAU.</w:t>
+      </w:r>
+    </w:p>
+    <w:p>
+      <w:pPr>
+        <w:jc w:val="left"/>
+      </w:pPr>
+    </w:p>
+    <w:p>
+      <w:pPr>
+        <w:pStyle w:val="Ttulo1"/>
+      </w:pPr>
+      <w:r>
         <w:t>RELEVANT SKILLS</w:t>
       </w:r>
     </w:p>
@@ -1889,21 +1427,13 @@
           <w:bCs/>
           <w:lang w:val="en-US" w:eastAsia="es-ES_tradnl"/>
         </w:rPr>
-        <w:t>Robotics</w:t>
-      </w:r>
-      <w:r>
-        <w:rPr>
-          <w:b/>
-          <w:bCs/>
+        <w:t>Robotics:</w:t>
+      </w:r>
+      <w:r>
+        <w:rPr>
           <w:lang w:val="en-US" w:eastAsia="es-ES_tradnl"/>
         </w:rPr>
-        <w:t>:</w:t>
-      </w:r>
-      <w:r>
-        <w:rPr>
-          <w:lang w:val="en-US" w:eastAsia="es-ES_tradnl"/>
-        </w:rPr>
-        <w:t xml:space="preserve"> Robot Planning and Kinematics, Drake Robotics Toolbox, Pinocchio library, ROS.</w:t>
+        <w:t xml:space="preserve"> Motion and Manipulation Planning, Graphs of Convex Sets, Convex Decompositions (IRIS), Robot Kinematics; Drake, Pinocchio, MuJoCo, ROS.</w:t>
       </w:r>
     </w:p>
     <w:p>
@@ -1929,121 +1459,7 @@
         <w:rPr>
           <w:lang w:val="en-US" w:eastAsia="es-ES_tradnl"/>
         </w:rPr>
-        <w:t xml:space="preserve"> ML libraries (</w:t>
-      </w:r>
-      <w:proofErr w:type="spellStart"/>
-      <w:r>
-        <w:rPr>
-          <w:lang w:val="en-US" w:eastAsia="es-ES_tradnl"/>
-        </w:rPr>
-        <w:t>PyTorch</w:t>
-      </w:r>
-      <w:proofErr w:type="spellEnd"/>
-      <w:r>
-        <w:rPr>
-          <w:lang w:val="en-US" w:eastAsia="es-ES_tradnl"/>
-        </w:rPr>
-        <w:t xml:space="preserve">, </w:t>
-      </w:r>
-      <w:proofErr w:type="spellStart"/>
-      <w:r>
-        <w:rPr>
-          <w:lang w:val="en-US" w:eastAsia="es-ES_tradnl"/>
-        </w:rPr>
-        <w:t>Tensorflow</w:t>
-      </w:r>
-      <w:proofErr w:type="spellEnd"/>
-      <w:r>
-        <w:rPr>
-          <w:lang w:val="en-US" w:eastAsia="es-ES_tradnl"/>
-        </w:rPr>
-        <w:t xml:space="preserve">, </w:t>
-      </w:r>
-      <w:proofErr w:type="spellStart"/>
-      <w:r>
-        <w:rPr>
-          <w:lang w:val="en-US" w:eastAsia="es-ES_tradnl"/>
-        </w:rPr>
-        <w:t>Sklearn</w:t>
-      </w:r>
-      <w:proofErr w:type="spellEnd"/>
-      <w:r>
-        <w:rPr>
-          <w:lang w:val="en-US" w:eastAsia="es-ES_tradnl"/>
-        </w:rPr>
-        <w:t xml:space="preserve">, </w:t>
-      </w:r>
-      <w:proofErr w:type="spellStart"/>
-      <w:r>
-        <w:rPr>
-          <w:lang w:val="en-US" w:eastAsia="es-ES_tradnl"/>
-        </w:rPr>
-        <w:t>tqdm</w:t>
-      </w:r>
-      <w:proofErr w:type="spellEnd"/>
-      <w:r>
-        <w:rPr>
-          <w:lang w:val="en-US" w:eastAsia="es-ES_tradnl"/>
-        </w:rPr>
-        <w:t xml:space="preserve">, </w:t>
-      </w:r>
-      <w:proofErr w:type="spellStart"/>
-      <w:r>
-        <w:rPr>
-          <w:lang w:val="en-US" w:eastAsia="es-ES_tradnl"/>
-        </w:rPr>
-        <w:t>wandb</w:t>
-      </w:r>
-      <w:proofErr w:type="spellEnd"/>
-      <w:r>
-        <w:rPr>
-          <w:lang w:val="en-US" w:eastAsia="es-ES_tradnl"/>
-        </w:rPr>
-        <w:t xml:space="preserve">), </w:t>
-      </w:r>
-      <w:r>
-        <w:rPr>
-          <w:lang w:val="en-US" w:eastAsia="es-ES_tradnl"/>
-        </w:rPr>
-        <w:t>Deep Neural Networks, CNNs</w:t>
-      </w:r>
-      <w:r>
-        <w:rPr>
-          <w:lang w:val="en-US" w:eastAsia="es-ES_tradnl"/>
-        </w:rPr>
-        <w:t>,</w:t>
-      </w:r>
-      <w:r>
-        <w:rPr>
-          <w:lang w:val="en-US" w:eastAsia="es-ES_tradnl"/>
-        </w:rPr>
-        <w:t xml:space="preserve"> Reinforcement Learning,</w:t>
-      </w:r>
-      <w:r>
-        <w:rPr>
-          <w:lang w:val="en-US" w:eastAsia="es-ES_tradnl"/>
-        </w:rPr>
-        <w:t xml:space="preserve"> </w:t>
-      </w:r>
-      <w:r>
-        <w:rPr>
-          <w:lang w:val="en-US" w:eastAsia="es-ES_tradnl"/>
-        </w:rPr>
-        <w:t>Image Segmentation (</w:t>
-      </w:r>
-      <w:proofErr w:type="spellStart"/>
-      <w:r>
-        <w:rPr>
-          <w:lang w:val="en-US" w:eastAsia="es-ES_tradnl"/>
-        </w:rPr>
-        <w:t>UNet</w:t>
-      </w:r>
-      <w:proofErr w:type="spellEnd"/>
-      <w:r>
-        <w:rPr>
-          <w:lang w:val="en-US" w:eastAsia="es-ES_tradnl"/>
-        </w:rPr>
-        <w:t>, CLIP, Autoencoder architectures).</w:t>
+        <w:t xml:space="preserve"> ML libraries (PyTorch, Tensorflow, Sklearn, wandb), Deep Neural Networks, CNNs, Reinforcement Learning, Image Segmentation (UNet, CLIP, Autoencoder architectures).</w:t>
       </w:r>
     </w:p>
     <w:p>
@@ -2069,7 +1485,7 @@
         <w:rPr>
           <w:lang w:val="en-US" w:eastAsia="es-ES_tradnl"/>
         </w:rPr>
-        <w:t> Python (Matplotlib, NumPy, Pandas, OpenCV), Java (Maven, Spring Boot), C/C++ (Memory Management, Linux, Embedded Programming), Haskell, SQL, MIPS Assembly.</w:t>
+        <w:t> Python (Matplotlib, NumPy, Pandas, OpenCV), Java (Maven, Spring Boot), C/C++ (Memory Management, Linux, Embedded Programming), Haskell, SQL.</w:t>
       </w:r>
     </w:p>
     <w:p>
@@ -2095,7 +1511,7 @@
         <w:rPr>
           <w:lang w:val="en-US" w:eastAsia="es-ES_tradnl"/>
         </w:rPr>
-        <w:t> Linear and Non-linear Optimization, Mixed-Integer Programming.</w:t>
+        <w:t> Convex, Non-linear and Mixed-Integer Optimization; Constrained Sampling.</w:t>
       </w:r>
     </w:p>
     <w:p>
@@ -2121,25 +1537,7 @@
         <w:rPr>
           <w:lang w:val="en-US" w:eastAsia="es-ES_tradnl"/>
         </w:rPr>
-        <w:t> Altium (PCB Design), Fusion 360 (CAD), Git</w:t>
-      </w:r>
-      <w:r>
-        <w:rPr>
-          <w:lang w:val="en-US" w:eastAsia="es-ES_tradnl"/>
-        </w:rPr>
-        <w:t xml:space="preserve">, </w:t>
-      </w:r>
-      <w:r>
-        <w:rPr>
-          <w:lang w:val="en-US" w:eastAsia="es-ES_tradnl"/>
-        </w:rPr>
-        <w:t>Jira</w:t>
-      </w:r>
-      <w:r>
-        <w:rPr>
-          <w:lang w:val="en-US" w:eastAsia="es-ES_tradnl"/>
-        </w:rPr>
-        <w:t>, Agile development.</w:t>
+        <w:t xml:space="preserve"> Altium (PCB Design), Fusion 360 (CAD), Git.</w:t>
       </w:r>
     </w:p>
     <w:p>
@@ -2165,262 +1563,7 @@
         <w:rPr>
           <w:lang w:val="en-US" w:eastAsia="es-ES_tradnl"/>
         </w:rPr>
-        <w:t xml:space="preserve"> Raspberry Pi, Arduino, 3D Printing, </w:t>
-      </w:r>
-      <w:r>
-        <w:rPr>
-          <w:lang w:val="en-US" w:eastAsia="es-ES_tradnl"/>
-        </w:rPr>
-        <w:t xml:space="preserve">Electronics, Circuit Design, </w:t>
-      </w:r>
-      <w:r>
-        <w:rPr>
-          <w:lang w:val="en-US" w:eastAsia="es-ES_tradnl"/>
-        </w:rPr>
-        <w:t>Laser Cutting, Soldering.</w:t>
-      </w:r>
-    </w:p>
-    <w:p>
-      <w:pPr>
-        <w:jc w:val="left"/>
-      </w:pPr>
-    </w:p>
-    <w:p>
-      <w:pPr>
-        <w:pStyle w:val="Ttulo1"/>
-      </w:pPr>
-      <w:r>
-        <w:t>AWARDS</w:t>
-      </w:r>
-    </w:p>
-    <w:p>
-      <w:pPr>
-        <w:pStyle w:val="Ttulo2"/>
-        <w:tabs>
-          <w:tab w:val="right" w:pos="9923"/>
-        </w:tabs>
-        <w:rPr>
-          <w:b w:val="0"/>
-          <w:bCs w:val="0"/>
-        </w:rPr>
-      </w:pPr>
-      <w:r>
-        <w:t>The Edinburgh Award: Makerspace Student Technician</w:t>
-      </w:r>
-      <w:r>
-        <w:rPr>
-          <w:b w:val="0"/>
-          <w:bCs w:val="0"/>
-        </w:rPr>
-        <w:t xml:space="preserve"> </w:t>
-      </w:r>
-      <w:r>
-        <w:rPr>
-          <w:b w:val="0"/>
-          <w:bCs w:val="0"/>
-        </w:rPr>
-        <w:tab/>
-        <w:t>June 2024</w:t>
-      </w:r>
-    </w:p>
-    <w:p>
-      <w:pPr>
-        <w:jc w:val="left"/>
-      </w:pPr>
-      <w:r>
-        <w:t>Recognising successful performance in the role of Student Technician by completing a technical project, mentoring students in the Makerspace, and delivering relevant workshops.</w:t>
-      </w:r>
-    </w:p>
-    <w:p>
-      <w:pPr>
-        <w:jc w:val="left"/>
-      </w:pPr>
-    </w:p>
-    <w:p>
-      <w:pPr>
-        <w:tabs>
-          <w:tab w:val="right" w:pos="9923"/>
-        </w:tabs>
-        <w:jc w:val="left"/>
-      </w:pPr>
-      <w:r>
-        <w:rPr>
-          <w:b/>
-          <w:bCs/>
-        </w:rPr>
-        <w:t xml:space="preserve">The Edinburgh Award: Leadership in Student Opportunities </w:t>
-      </w:r>
-      <w:r>
-        <w:rPr>
-          <w:b/>
-          <w:bCs/>
-        </w:rPr>
-        <w:tab/>
-      </w:r>
-      <w:r>
-        <w:t>April 2023</w:t>
-      </w:r>
-    </w:p>
-    <w:p>
-      <w:pPr>
-        <w:jc w:val="left"/>
-        <w:rPr>
-          <w:lang w:val="en-US" w:eastAsia="es-ES_tradnl"/>
-        </w:rPr>
-      </w:pPr>
-      <w:r>
-        <w:t>Recognis</w:t>
-      </w:r>
-      <w:r>
-        <w:t>ing</w:t>
-      </w:r>
-      <w:r>
-        <w:t xml:space="preserve"> leadership</w:t>
-      </w:r>
-      <w:r>
-        <w:t xml:space="preserve">, communication, critical thinking, and digital literacy skills </w:t>
-      </w:r>
-      <w:r>
-        <w:t>as UG3 Rep</w:t>
-      </w:r>
-      <w:r>
-        <w:t>.</w:t>
-      </w:r>
-    </w:p>
-    <w:p>
-      <w:pPr>
-        <w:jc w:val="left"/>
-        <w:rPr>
-          <w:lang w:val="en-US"/>
-        </w:rPr>
-      </w:pPr>
-    </w:p>
-    <w:p>
-      <w:pPr>
-        <w:pStyle w:val="Ttulo2"/>
-        <w:tabs>
-          <w:tab w:val="right" w:pos="9923"/>
-        </w:tabs>
-        <w:rPr>
-          <w:b w:val="0"/>
-          <w:bCs w:val="0"/>
-          <w:lang w:val="en-US"/>
-        </w:rPr>
-      </w:pPr>
-      <w:r>
-        <w:rPr>
-          <w:lang w:val="en-US"/>
-        </w:rPr>
-        <w:t>1</w:t>
-      </w:r>
-      <w:r>
-        <w:rPr>
-          <w:vertAlign w:val="superscript"/>
-          <w:lang w:val="en-US"/>
-        </w:rPr>
-        <w:t>st</w:t>
-      </w:r>
-      <w:r>
-        <w:rPr>
-          <w:lang w:val="en-US"/>
-        </w:rPr>
-        <w:t xml:space="preserve"> Prize Overall in AdaHack Hackathon: Twitter Solves Rubik’s Cube</w:t>
-      </w:r>
-      <w:r>
-        <w:rPr>
-          <w:lang w:val="en-US"/>
-        </w:rPr>
-        <w:tab/>
-      </w:r>
-      <w:r>
-        <w:rPr>
-          <w:b w:val="0"/>
-          <w:bCs w:val="0"/>
-          <w:lang w:val="en-US"/>
-        </w:rPr>
-        <w:t>November 2022</w:t>
-      </w:r>
-    </w:p>
-    <w:p>
-      <w:pPr>
-        <w:jc w:val="left"/>
-      </w:pPr>
-      <w:r>
-        <w:rPr>
-          <w:lang w:val="en-US"/>
-        </w:rPr>
-        <w:t xml:space="preserve">Used Twitter API to gather Rubik’s cube moves from the </w:t>
-      </w:r>
-      <w:r>
-        <w:rPr>
-          <w:lang w:val="en-US"/>
-        </w:rPr>
-        <w:t>platform</w:t>
-      </w:r>
-      <w:r>
-        <w:rPr>
-          <w:lang w:val="en-US"/>
-        </w:rPr>
-        <w:t>, showing</w:t>
-      </w:r>
-      <w:r>
-        <w:rPr>
-          <w:lang w:val="en-US"/>
-        </w:rPr>
-        <w:t xml:space="preserve"> the cube’s change in 3D.</w:t>
-      </w:r>
-    </w:p>
-    <w:p>
-      <w:pPr>
-        <w:tabs>
-          <w:tab w:val="right" w:pos="9781"/>
-        </w:tabs>
-        <w:jc w:val="left"/>
-        <w:rPr>
-          <w:lang w:val="en-US" w:eastAsia="es-ES_tradnl"/>
-        </w:rPr>
-      </w:pPr>
-    </w:p>
-    <w:p>
-      <w:pPr>
-        <w:tabs>
-          <w:tab w:val="right" w:pos="9923"/>
-        </w:tabs>
-        <w:jc w:val="left"/>
-      </w:pPr>
-      <w:r>
-        <w:rPr>
-          <w:b/>
-          <w:bCs/>
-        </w:rPr>
-        <w:t>Award of Academic Excellence</w:t>
-      </w:r>
-      <w:r>
-        <w:rPr>
-          <w:b/>
-          <w:bCs/>
-        </w:rPr>
-        <w:tab/>
-      </w:r>
-      <w:r>
-        <w:t>July 2020</w:t>
-      </w:r>
-    </w:p>
-    <w:p>
-      <w:pPr>
-        <w:tabs>
-          <w:tab w:val="right" w:pos="9781"/>
-        </w:tabs>
-        <w:jc w:val="left"/>
-        <w:rPr>
-          <w:lang w:val="en-US" w:eastAsia="es-ES_tradnl"/>
-        </w:rPr>
-      </w:pPr>
-      <w:r>
-        <w:rPr>
-          <w:lang w:val="en-US" w:eastAsia="es-ES_tradnl"/>
-        </w:rPr>
-        <w:t>Top 10 academic performances in the district of S/C de Tenerife (over 5,000 students) for the last two years of high school and the National University Entrance Exam (EBAU).</w:t>
+        <w:t xml:space="preserve"> Raspberry Pi, Arduino, 3D Printing, Electronics, Circuit Design, Laser Cutting, Soldering.</w:t>
       </w:r>
     </w:p>
     <w:p>
@@ -2794,7 +1937,7 @@
       <w:lvlText w:val=""/>
       <w:lvlJc w:val="left"/>
       <w:pPr>
-        <w:ind w:left="720" w:hanging="360"/>
+        <w:ind w:left="397" w:hanging="284"/>
       </w:pPr>
       <w:rPr>
         <w:rFonts w:ascii="Symbol" w:hAnsi="Symbol" w:hint="default"/>
@@ -2907,7 +2050,7 @@
       <w:lvlText w:val=""/>
       <w:lvlJc w:val="left"/>
       <w:pPr>
-        <w:ind w:left="720" w:hanging="360"/>
+        <w:ind w:left="397" w:hanging="284"/>
       </w:pPr>
       <w:rPr>
         <w:rFonts w:ascii="Symbol" w:hAnsi="Symbol" w:hint="default"/>
@@ -4385,7 +3528,7 @@
       <w:lvlText w:val=""/>
       <w:lvlJc w:val="left"/>
       <w:pPr>
-        <w:ind w:left="720" w:hanging="360"/>
+        <w:ind w:left="397" w:hanging="284"/>
       </w:pPr>
       <w:rPr>
         <w:rFonts w:ascii="Symbol" w:hAnsi="Symbol" w:hint="default"/>
@@ -4724,7 +3867,7 @@
       <w:lvlText w:val=""/>
       <w:lvlJc w:val="left"/>
       <w:pPr>
-        <w:ind w:left="720" w:hanging="360"/>
+        <w:ind w:left="397" w:hanging="284"/>
       </w:pPr>
       <w:rPr>
         <w:rFonts w:ascii="Symbol" w:hAnsi="Symbol" w:hint="default"/>
@@ -5854,7 +4997,7 @@
       <w:lvlText w:val=""/>
       <w:lvlJc w:val="left"/>
       <w:pPr>
-        <w:ind w:left="720" w:hanging="360"/>
+        <w:ind w:left="397" w:hanging="284"/>
       </w:pPr>
       <w:rPr>
         <w:rFonts w:ascii="Symbol" w:hAnsi="Symbol" w:hint="default"/>
@@ -6080,7 +5223,7 @@
       <w:lvlText w:val=""/>
       <w:lvlJc w:val="left"/>
       <w:pPr>
-        <w:ind w:left="720" w:hanging="360"/>
+        <w:ind w:left="397" w:hanging="284"/>
       </w:pPr>
       <w:rPr>
         <w:rFonts w:ascii="Symbol" w:hAnsi="Symbol" w:hint="default"/>
@@ -6531,7 +5674,7 @@
       <w:lvlText w:val=""/>
       <w:lvlJc w:val="left"/>
       <w:pPr>
-        <w:ind w:left="720" w:hanging="360"/>
+        <w:ind w:left="397" w:hanging="284"/>
       </w:pPr>
       <w:rPr>
         <w:rFonts w:ascii="Symbol" w:hAnsi="Symbol" w:hint="default"/>
@@ -6644,7 +5787,7 @@
       <w:lvlText w:val=""/>
       <w:lvlJc w:val="left"/>
       <w:pPr>
-        <w:ind w:left="720" w:hanging="360"/>
+        <w:ind w:left="397" w:hanging="284"/>
       </w:pPr>
       <w:rPr>
         <w:rFonts w:ascii="Symbol" w:hAnsi="Symbol" w:hint="default"/>
@@ -8069,14 +7212,14 @@
     <w:qFormat/>
     <w:rsid w:val="00082E4E"/>
     <w:pPr>
-      <w:spacing w:line="276" w:lineRule="auto"/>
-      <w:jc w:val="both"/>
+      <w:spacing w:line="264" w:lineRule="auto"/>
+      <w:jc w:val="left"/>
     </w:pPr>
     <w:rPr>
       <w:rFonts w:ascii="Arial" w:hAnsi="Arial" w:cs="Arial"/>
       <w:color w:val="000000" w:themeColor="text1"/>
-      <w:sz w:val="20"/>
-      <w:szCs w:val="20"/>
+      <w:sz w:val="21"/>
+      <w:szCs w:val="21"/>
       <w:lang w:val="en-GB"/>
     </w:rPr>
   </w:style>
@@ -8257,7 +7400,7 @@
     <w:qFormat/>
     <w:rsid w:val="00C65D9E"/>
     <w:pPr>
-      <w:ind w:left="720"/>
+      <w:ind w:left="397"/>
       <w:contextualSpacing/>
     </w:pPr>
   </w:style>
@@ -8272,12 +7415,12 @@
     <w:qFormat/>
     <w:rsid w:val="00767CB1"/>
     <w:pPr>
-      <w:jc w:val="both"/>
+      <w:jc w:val="left"/>
     </w:pPr>
     <w:rPr>
       <w:rFonts w:ascii="Times New Roman" w:hAnsi="Times New Roman" w:cs="Times New Roman"/>
-      <w:sz w:val="20"/>
-      <w:szCs w:val="20"/>
+      <w:sz w:val="21"/>
+      <w:szCs w:val="21"/>
       <w:lang w:val="en-GB"/>
     </w:rPr>
   </w:style>
@@ -8292,8 +7435,8 @@
       <w:b/>
       <w:bCs/>
       <w:color w:val="000000" w:themeColor="text1"/>
-      <w:sz w:val="20"/>
-      <w:szCs w:val="20"/>
+      <w:sz w:val="21"/>
+      <w:szCs w:val="21"/>
       <w:lang w:val="en-GB"/>
     </w:rPr>
   </w:style>
@@ -8308,8 +7451,8 @@
       <w:i/>
       <w:iCs/>
       <w:color w:val="000000" w:themeColor="text1"/>
-      <w:sz w:val="20"/>
-      <w:szCs w:val="20"/>
+      <w:sz w:val="21"/>
+      <w:szCs w:val="21"/>
       <w:lang w:val="en-GB"/>
     </w:rPr>
   </w:style>

</xml_diff>